<commit_message>
Documento: enlace real del repositorio en la tabla de entregables
Queda pendiente sustituir el marcador del tablero de Jira cuando el
proyecto este creado.

Co-Authored-By: Claude Opus 5 <noreply@anthropic.com>
Claude-Session: https://claude.ai/code/session_01YXYZfyDi2ZARHQYeN24Zyb
</commit_message>
<xml_diff>
--- a/documentacion/Proyecto_Final_Programacion_III_Triana_Garcia.docx
+++ b/documentacion/Proyecto_Final_Programacion_III_Triana_Garcia.docx
@@ -21723,7 +21723,7 @@
               <w:rPr>
                 <w:sz w:val="19"/>
               </w:rPr>
-              <w:t>https://github.com/USUARIO/biblioitla</w:t>
+              <w:t>https://github.com/garciadejesustrianaolivadia165-a11y/Biblioitla</w:t>
             </w:r>
           </w:p>
         </w:tc>
@@ -21799,7 +21799,7 @@
               <w:rPr>
                 <w:sz w:val="19"/>
               </w:rPr>
-              <w:t>https://github.com/USUARIO/biblioitla/tree/main/pruebas</w:t>
+              <w:t>https://github.com/garciadejesustrianaolivadia165-a11y/Biblioitla/tree/main/pruebas</w:t>
             </w:r>
           </w:p>
         </w:tc>
@@ -21837,7 +21837,7 @@
               <w:rPr>
                 <w:sz w:val="19"/>
               </w:rPr>
-              <w:t>https://github.com/USUARIO/biblioitla/actions</w:t>
+              <w:t>https://github.com/garciadejesustrianaolivadia165-a11y/Biblioitla/actions</w:t>
             </w:r>
           </w:p>
         </w:tc>

</xml_diff>